<commit_message>
another change in develop_test
</commit_message>
<xml_diff>
--- a/develop_test.docx
+++ b/develop_test.docx
@@ -32,6 +32,19 @@
           <w:lang w:val="en-US"/>
         </w:rPr>
         <w:t>Change1</w:t>
+      </w:r>
+    </w:p>
+    <w:p>
+      <w:pPr>
+        <w:rPr>
+          <w:lang w:val="en-US"/>
+        </w:rPr>
+      </w:pPr>
+      <w:r>
+        <w:rPr>
+          <w:lang w:val="en-US"/>
+        </w:rPr>
+        <w:t>Change2</w:t>
       </w:r>
     </w:p>
     <w:sectPr>

</xml_diff>